<commit_message>
Prepare AutoValue project for GitHub
</commit_message>
<xml_diff>
--- a/NNDL_Project_Report.docx
+++ b/NNDL_Project_Report.docx
@@ -6,6 +6,7 @@
       <w:pPr>
         <w:jc w:val="center"/>
         <w:rPr>
+          <w:rFonts w:hint="eastAsia"/>
           <w:b/>
           <w:sz w:val="18"/>
         </w:rPr>
@@ -67,6 +68,7 @@
     <w:p>
       <w:pPr>
         <w:rPr>
+          <w:rFonts w:hint="eastAsia"/>
           <w:b/>
           <w:sz w:val="18"/>
         </w:rPr>
@@ -78,6 +80,7 @@
         <w:spacing w:after="360"/>
         <w:jc w:val="center"/>
         <w:rPr>
+          <w:rFonts w:hint="eastAsia"/>
           <w:b/>
           <w:bCs/>
           <w:sz w:val="32"/>
@@ -121,6 +124,9 @@
     <w:p>
       <w:pPr>
         <w:spacing w:before="240"/>
+        <w:rPr>
+          <w:rFonts w:hint="eastAsia"/>
+        </w:rPr>
       </w:pPr>
     </w:p>
     <w:p>
@@ -142,11 +148,22 @@
       </w:r>
     </w:p>
     <w:p>
+      <w:pPr>
+        <w:rPr>
+          <w:rFonts w:hint="eastAsia"/>
+        </w:rPr>
+      </w:pPr>
       <w:r>
         <w:t>A study of car price prediction using linear regression, Keras and a neural network built with NumPy.</w:t>
       </w:r>
     </w:p>
-    <w:p/>
+    <w:p>
+      <w:pPr>
+        <w:rPr>
+          <w:rFonts w:hint="eastAsia"/>
+        </w:rPr>
+      </w:pPr>
+    </w:p>
     <w:tbl>
       <w:tblPr>
         <w:tblStyle w:val="TableGrid"/>
@@ -173,6 +190,7 @@
               <w:spacing w:before="340" w:after="140"/>
               <w:jc w:val="center"/>
               <w:rPr>
+                <w:rFonts w:hint="eastAsia"/>
                 <w:b/>
               </w:rPr>
             </w:pPr>
@@ -196,6 +214,7 @@
               <w:spacing w:before="340" w:after="140"/>
               <w:jc w:val="center"/>
               <w:rPr>
+                <w:rFonts w:hint="eastAsia"/>
                 <w:b/>
               </w:rPr>
             </w:pPr>
@@ -224,6 +243,7 @@
               <w:spacing w:before="340" w:after="140"/>
               <w:jc w:val="center"/>
               <w:rPr>
+                <w:rFonts w:hint="eastAsia"/>
                 <w:b/>
               </w:rPr>
             </w:pPr>
@@ -247,6 +267,7 @@
               <w:spacing w:before="340" w:after="140"/>
               <w:jc w:val="center"/>
               <w:rPr>
+                <w:rFonts w:hint="eastAsia"/>
                 <w:b/>
               </w:rPr>
             </w:pPr>
@@ -275,6 +296,7 @@
               <w:spacing w:before="340" w:after="140"/>
               <w:jc w:val="center"/>
               <w:rPr>
+                <w:rFonts w:hint="eastAsia"/>
                 <w:b/>
               </w:rPr>
             </w:pPr>
@@ -298,6 +320,7 @@
               <w:spacing w:before="340" w:after="140"/>
               <w:jc w:val="center"/>
               <w:rPr>
+                <w:rFonts w:hint="eastAsia"/>
                 <w:b/>
               </w:rPr>
             </w:pPr>
@@ -318,6 +341,7 @@
         </w:tabs>
         <w:spacing w:before="340" w:after="140"/>
         <w:rPr>
+          <w:rFonts w:hint="eastAsia"/>
           <w:b/>
           <w:sz w:val="18"/>
         </w:rPr>
@@ -351,6 +375,28 @@
         </w:rPr>
         <w:tab/>
       </w:r>
+      <w:r>
+        <w:tab/>
+      </w:r>
+    </w:p>
+    <w:p>
+      <w:pPr>
+        <w:tabs>
+          <w:tab w:val="left" w:pos="6120"/>
+        </w:tabs>
+        <w:spacing w:after="140"/>
+      </w:pPr>
+      <w:r>
+        <w:t>Abhishek Vanahalli</w:t>
+      </w:r>
+      <w:r>
+        <w:t xml:space="preserve"> [ </w:t>
+      </w:r>
+      <w:proofErr w:type="gramStart"/>
+      <w:r>
+        <w:t>25122026 ]</w:t>
+      </w:r>
+      <w:proofErr w:type="gramEnd"/>
     </w:p>
     <w:p>
       <w:pPr>
@@ -394,36 +440,6 @@
       <w:r>
         <w:t xml:space="preserve">  </w:t>
       </w:r>
-      <w:r>
-        <w:tab/>
-      </w:r>
-    </w:p>
-    <w:p>
-      <w:pPr>
-        <w:tabs>
-          <w:tab w:val="left" w:pos="6120"/>
-        </w:tabs>
-        <w:spacing w:after="140"/>
-      </w:pPr>
-      <w:r>
-        <w:t>Abhishek Vanahalli</w:t>
-      </w:r>
-      <w:r>
-        <w:t xml:space="preserve"> [ </w:t>
-      </w:r>
-      <w:proofErr w:type="gramStart"/>
-      <w:r>
-        <w:t>25122026 ]</w:t>
-      </w:r>
-      <w:proofErr w:type="gramEnd"/>
-    </w:p>
-    <w:p>
-      <w:pPr>
-        <w:tabs>
-          <w:tab w:val="left" w:pos="6120"/>
-        </w:tabs>
-        <w:spacing w:after="140"/>
-      </w:pPr>
     </w:p>
     <w:p>
       <w:pPr>
@@ -432,6 +448,18 @@
         </w:tabs>
         <w:spacing w:after="140"/>
         <w:rPr>
+          <w:rFonts w:hint="eastAsia"/>
+        </w:rPr>
+      </w:pPr>
+    </w:p>
+    <w:p>
+      <w:pPr>
+        <w:tabs>
+          <w:tab w:val="left" w:pos="6120"/>
+        </w:tabs>
+        <w:spacing w:after="140"/>
+        <w:rPr>
+          <w:rFonts w:hint="eastAsia"/>
           <w:b/>
           <w:bCs/>
           <w:sz w:val="28"/>
@@ -17614,9 +17642,6 @@
       <w:instrText>PAGE</w:instrText>
     </w:r>
     <w:r>
-      <w:rPr>
-        <w:rFonts w:hint="eastAsia"/>
-      </w:rPr>
       <w:fldChar w:fldCharType="separate"/>
     </w:r>
     <w:r>

</xml_diff>